<commit_message>
Fix resume PDF and Word downloads on the live site.
Replace stale public exports with regenerated files and add cache-busting query params so browsers fetch the updated documents after deploy.

Co-authored-by: Cursor <cursoragent@cursor.com>
</commit_message>
<xml_diff>
--- a/public/resume.docx
+++ b/public/resume.docx
@@ -3,469 +3,47 @@
 <w:document xmlns:wpc="http://schemas.microsoft.com/office/word/2010/wordprocessingCanvas" xmlns:mo="http://schemas.microsoft.com/office/mac/office/2008/main" xmlns:mc="http://schemas.openxmlformats.org/markup-compatibility/2006" xmlns:mv="urn:schemas-microsoft-com:mac:vml" xmlns:o="urn:schemas-microsoft-com:office:office" xmlns:r="http://schemas.openxmlformats.org/officeDocument/2006/relationships" xmlns:m="http://schemas.openxmlformats.org/officeDocument/2006/math" xmlns:v="urn:schemas-microsoft-com:vml" xmlns:wp14="http://schemas.microsoft.com/office/word/2010/wordprocessingDrawing" xmlns:wp="http://schemas.openxmlformats.org/drawingml/2006/wordprocessingDrawing" xmlns:w10="urn:schemas-microsoft-com:office:word" xmlns:w="http://schemas.openxmlformats.org/wordprocessingml/2006/main" xmlns:w14="http://schemas.microsoft.com/office/word/2010/wordml" xmlns:wpg="http://schemas.microsoft.com/office/word/2010/wordprocessingGroup" xmlns:wpi="http://schemas.microsoft.com/office/word/2010/wordprocessingInk" xmlns:wne="http://schemas.microsoft.com/office/word/2006/wordml" xmlns:wps="http://schemas.microsoft.com/office/word/2010/wordprocessingShape" mc:Ignorable="w14 wp14">
   <w:body>
     <w:p>
-      <w:r>
-        <w:t>Rihan Mohammed — Full Stack Developer @import url('https://fonts.googleapis.com/css2?family=Inter:wght@300;400;500;600;700;800&amp;family=JetBrains+Mono:wght@400;500&amp;display=swap'); :root { --primary: #0f766e; --primary-dark: #0d5c56; --accent: #f59e0b; --text: #1e293b; --text-muted: #64748b; --border: #e2e8f0; --bg: #ffffff; --sidebar: #0f172a; --sidebar-text: #cbd5e1; } * { margin: 0; padding: 0; box-sizing: border-box; } body { font-family: 'Inter', -apple-system, BlinkMacSystemFont, sans-serif; color: var(--text); background: #f1f5f9; line-height: 1.55; font-size: 10.5pt; } .page { max-width: 900px; margin: 24px auto; background: var(--bg); box-shadow: 0 25px 50px -12px rgba(0,0,0,.15); display: grid; grid-template-columns: 280px 1fr; min-height: 1120px; } /* Sidebar */ .sidebar { background: linear-gradient(175deg, var(--sidebar) 0%, #1e293b 100%); color: var(--sidebar-text); padding: 36px 28px; } .sidebar h1 { font-size: 22px; font-weight: 800; color: #fff; line-height: 1.2; margin-bottom: 4px; } .sidebar .title { font-size: 11px; font-weight: 600; color: var(--accent); text-transform: uppercase; letter-spacing: 1.5px; margin-bottom: 28px; } .sidebar-section { margin-bottom: 26px; } .sidebar-section h2 { font-size: 9px; font-weight: 700; text-transform: uppercase; letter-spacing: 2px; color: var(--primary); margin-bottom: 12px; padding-bottom: 6px; border-bottom: 1px solid rgba(255,255,255,.12); } .contact-item { display: flex; align-items: flex-start; gap: 10px; margin-bottom: 10px; font-size: 10px; line-height: 1.45; } .contact-item .icon { width: 16px; height: 16px; flex-shrink: 0; color: var(--accent); margin-top: 1px; display: flex; align-items: center; justify-content: center; } .contact-item .icon svg { width: 14px; height: 14px; fill: currentColor; display: block; } .skill-group { margin-bottom: 14px; } .skill-group h3 { font-size: 9.5px; font-weight: 600; color: #94a3b8; margin-bottom: 6px; } .skill-tags { display: flex; flex-wrap: wrap; gap: 5px; } .skill-tag { background: rgba(255,255,255,.08); border: 1px solid rgba(255,255,255,.12); border-radius: 4px; padding: 3px 8px; font-size: 8.5px; font-weight: 500; color: #e2e8f0; } /* Main content */ .main { padding: 36px 36px 36px 32px; } .summary { font-size: 10.5px; color: var(--text-muted); line-height: 1.65; margin-bottom: 28px; padding-bottom: 24px; border-bottom: 2px solid var(--border); } .section { margin-bottom: 26px; } .section-header { display: flex; align-items: center; gap: 10px; margin-bottom: 16px; } .section-header h2 { font-size: 13px; font-weight: 800; text-transform: uppercase; letter-spacing: 1.2px; color: var(--primary-dark); white-space: nowrap; } .section-header .line { flex: 1; height: 2px; background: linear-gradient(90deg, var(--primary), transparent); } /* Experience */ .job { margin-bottom: 22px; } .job-header { display: flex; justify-content: space-between; align-items: flex-start; margin-bottom: 4px; } .job-title { font-size: 12.5px; font-weight: 700; color: var(--text); } .job-company { font-size: 11px; font-weight: 600; color: var(--primary); } .job-meta { text-align: right; font-size: 9.5px; color: var(--text-muted); white-space: nowrap; } .job-meta .duration { font-weight: 600; color: var(--text); } .job-desc { font-size: 10px; color: var(--text-muted); margin: 6px 0 8px; font-style: italic; } .job ul { list-style: none; padding: 0; } .job ul li { position: relative; padding-left: 14px; margin-bottom: 5px; font-size: 10px; line-height: 1.55; color: var(--text); } .job ul li::before { content: '▸'; position: absolute; left: 0; color: var(--primary); font-weight: 700; } .job ul li strong { color: var(--text); font-weight: 600; } /* Projects grid */ .projects-grid { display: grid; grid-template-columns: 1fr 1fr; gap: 12px; } .project-card { border: 1px solid var(--border); border-radius: 8px; padding: 12px 14px; background: #fafbfc; } .project-card h3 { font-size: 10.5px; font-weight: 700; color: var(--primary-dark); margin-bottom: 4px; } .project-card .stack { font-family: 'JetBrains Mono', monospace; font-size: 7.5px; color: var(--accent); margin-bottom: 6px; } .project-card p { font-size: 9px; color: var(--text-muted); line-height: 1.5; } /* Education placeholder */ .edu-item { display: flex; justify-content: space-between; align-items: baseline; } .edu-item .degree { font-weight: 600; font-size: 11px; } .edu-item .school { font-size: 10px; color: var(--primary); } .edu-item .year { font-size: 9.5px; color: var(--text-muted); } .cert-grid { display: grid; grid-template-columns: 1fr 1fr; gap: 4px 16px; } .cert-item { font-size: 9px; line-height: 1.4; color: var(--text); padding-left: 10px; position: relative; } .cert-item::before { content: '▸'; position: absolute; left: 0; color: var(--primary); font-weight: 700; font-size: 8px; } @media print { html, body { width: 210mm; height: 297mm; overflow: hidden; } body { background: #fff; font-size: 8pt; line-height: 1.32; } .page { margin: 0; box-shadow: none; max-width: 100%; width: 210mm; height: 297mm; display: grid; grid-template-columns: 220px 1fr; min-height: auto; overflow: hidden; page-break-after: avoid; page-break-inside: avoid; } .sidebar { padding: 14px 16px; break-inside: auto; page-break-inside: auto; } .sidebar h1 { font-size: 17px; margin-bottom: 2px; } .sidebar .title { font-size: 9px; margin-bottom: 14px; } .sidebar-section { margin-bottom: 12px; } .sidebar-section h2 { font-size: 7.5px; margin-bottom: 6px; padding-bottom: 4px; } .contact-item { margin-bottom: 5px; font-size: 8px; gap: 6px; } .skill-group { margin-bottom: 8px; } .skill-group h3 { font-size: 8px; margin-bottom: 3px; } .skill-tag { font-size: 7px; padding: 2px 5px; } .main { padding: 14px 18px 10px 16px; } .summary { font-size: 8px; line-height: 1.45; margin-bottom: 10px; padding-bottom: 8px; } .section { margin-bottom: 10px; } .section-header { margin-bottom: 8px; gap: 6px; } .section-header h2 { font-size: 10px; } .job { margin-bottom: 8px; break-inside: auto; page-break-inside: auto; } .job-title { font-size: 10px; } .job-company { font-size: 9px; } .job-meta { font-size: 8px; } .job-desc { font-size: 8px; margin: 3px 0 4px; } .job ul li { margin-bottom: 2px; font-size: 7.8px; line-height: 1.35; padding-left: 11px; } .projects-grid { gap: 5px; } .project-card { padding: 5px 7px; break-inside: auto; page-break-inside: auto; } .project-card h3 { font-size: 8.5px; margin-bottom: 2px; } .project-card .stack { font-size: 6.5px; margin-bottom: 3px; } .project-card p { font-size: 7.2px; line-height: 1.35; } .edu-item .degree { font-size: 9px; } .edu-item .school { font-size: 8px; } .cert-grid { grid-template-columns: 1fr 1fr 1fr; gap: 1px 8px; } .cert-item { font-size: 6.8px; line-height: 1.28; padding-left: 8px; } .cert-item::before { font-size: 6.5px; } } @page { size: A4; margin: 0; } body { font-size: 8pt; line-height: 1.32; } .page { max-width: 210mm; display: block; } .sidebar { padding: 14px 16px; } .sidebar h1 { font-size: 17px; } .sidebar .title { font-size: 9px; margin-bottom: 14px; } .sidebar-section { margin-bottom: 12px; } .contact-item { font-size: 8px; margin-bottom: 5px; } .skill-tag { font-size: 7px; padding: 2px 5px; } .main { padding: 14px 18px 10px 16px; } .summary { font-size: 8px; line-height: 1.45; margin-bottom: 10px; padding-bottom: 8px; } .section { margin-bottom: 10px; } .section-header { margin-bottom: 8px; } .section-header h2 { font-size: 10px; } .job { margin-bottom: 8px; } .job-title { font-size: 10px; } .job ul li { font-size: 7.8px; line-height: 1.35; margin-bottom: 2px; } .projects-grid { gap: 5px; } .project-card { padding: 5px 7px; } .project-card h3 { font-size: 8.5px; } .project-card p { font-size: 7.2px; line-height: 1.35; } .cert-grid { display: grid; grid-template-columns: 1fr 1fr 1fr; gap: 1px 8px; } .cert-item { font-size: 6.8px; line-height: 1.28; } Rihan Mohammed</w:t>
-      </w:r>
-    </w:p>
-    <w:p>
       <w:pPr>
-        <w:pStyle w:val="Heading1"/>
-      </w:pPr>
-    </w:p>
-    <w:p>
-      <w:r>
-        <w:t>Full Stack Developer</w:t>
-      </w:r>
-    </w:p>
-    <w:p>
-      <w:pPr>
-        <w:pStyle w:val="Heading2"/>
+        <w:spacing w:before="0" w:after="0" w:line="240" w:lineRule="auto"/>
       </w:pPr>
       <w:r>
-        <w:t>Contact</w:t>
-      </w:r>
-    </w:p>
-    <w:p>
-      <w:r>
-        <w:t>im.rihan.dev@gmail.com mailto:im.rihan.dev@gmail.com +91 76820 78927 tel:+917682078927 Puri, Odisha, India Bhagabanpur, Panaspada, Brahmagiri, Puri 752011 linkedin.com/in/im-rihan https://www.linkedin.com/in/im-rihan github.com/im-rihan https://github.com/im-rihan Technical Skills</w:t>
-      </w:r>
-    </w:p>
-    <w:p>
-      <w:pPr>
-        <w:pStyle w:val="Heading2"/>
-      </w:pPr>
-    </w:p>
-    <w:p>
-      <w:pPr>
-        <w:pStyle w:val="Heading3"/>
-      </w:pPr>
-      <w:r>
-        <w:t>Frontend</w:t>
-      </w:r>
-    </w:p>
-    <w:p>
-      <w:r>
-        <w:t>ReactNext.js 15 TypeScriptJavaScript Tailwind CSSWebpack ZustandTanStack Query FormikPrimeReact Backend</w:t>
-      </w:r>
-    </w:p>
-    <w:p>
-      <w:pPr>
-        <w:pStyle w:val="Heading3"/>
-      </w:pPr>
-    </w:p>
-    <w:p>
-      <w:r>
-        <w:t>NestJSNode.js PHP 8TypeORM ExpressREST APIs BullMQSSE Streaming Data &amp; Search</w:t>
-      </w:r>
-    </w:p>
-    <w:p>
-      <w:pPr>
-        <w:pStyle w:val="Heading3"/>
-      </w:pPr>
-    </w:p>
-    <w:p>
-      <w:r>
-        <w:t>MySQLRedis TypesensePython Data AnalysisData Ingestion AI &amp; Integrations</w:t>
-      </w:r>
-    </w:p>
-    <w:p>
-      <w:pPr>
-        <w:pStyle w:val="Heading3"/>
-      </w:pPr>
-    </w:p>
-    <w:p>
-      <w:r>
-        <w:t>LangChainOpenAI Google GeminiZoho CRM TwilioSendGrid DevOps &amp; Cloud</w:t>
-      </w:r>
-    </w:p>
-    <w:p>
-      <w:pPr>
-        <w:pStyle w:val="Heading3"/>
-      </w:pPr>
-    </w:p>
-    <w:p>
-      <w:r>
-        <w:t>CI/CDGitHub Actions DockerAWS Lambda Amazon EC2VercelHetzner CloudflareNginx Languages</w:t>
-      </w:r>
-    </w:p>
-    <w:p>
-      <w:pPr>
-        <w:pStyle w:val="Heading2"/>
-      </w:pPr>
-    </w:p>
-    <w:p>
-      <w:r>
-        <w:t>English — Fluent Passionate Full Stack Developer with nearly 4 years at HomeAbroad Inc. and Ziffy.ai, building production fintech and real-estate platforms at scale. Skilled in JavaScript, React, Next.js, Node.js, Python, and cloud infrastructure — from AI-native property search and NestJS APIs to PHP webhook backends, data ingestion pipelines, and AWS deployments. Committed to delivering innovative, user-focused solutions through effective collaboration and continuous learning.</w:t>
-      </w:r>
-    </w:p>
-    <w:p>
-      <w:pPr>
-        <w:pStyle w:val="Heading2"/>
-      </w:pPr>
-      <w:r>
-        <w:t>Experience</w:t>
-      </w:r>
-    </w:p>
-    <w:p>
-      <w:r>
-        <w:t>Full Stack Engineer Ziffy.ai · Full-time Jan 2025 – Present 1 yr 6 mos · Remote AI-native real estate investment platform — ziffy.ai</w:t>
-      </w:r>
-    </w:p>
-    <w:p>
-      <w:pPr>
-        <w:pStyle w:val="ListBullet"/>
-      </w:pPr>
-      <w:r>
-        <w:t xml:space="preserve">Architected and shipped the </w:t>
-      </w:r>
-      <w:r>
-        <w:rPr>
-          <w:b/>
-        </w:rPr>
-        <w:t>Next.js 15 / React 19</w:t>
-      </w:r>
-      <w:r>
-        <w:t xml:space="preserve"> frontend for Ziffy.ai with dual-brand support (Ziffy + HomeAbroad), deployed on </w:t>
-      </w:r>
-      <w:r>
-        <w:rPr>
-          <w:b/>
-        </w:rPr>
-        <w:t>Vercel</w:t>
-      </w:r>
-      <w:r>
-        <w:t xml:space="preserve"> with ISR, BunnyCDN sitemaps, and brand-specific analytics.</w:t>
-      </w:r>
-    </w:p>
-    <w:p>
-      <w:pPr>
-        <w:pStyle w:val="ListBullet"/>
-      </w:pPr>
-      <w:r>
-        <w:t xml:space="preserve">Built </w:t>
-      </w:r>
-      <w:r>
-        <w:rPr>
-          <w:b/>
-        </w:rPr>
-        <w:t>AI-powered property search</w:t>
-      </w:r>
-      <w:r>
-        <w:t xml:space="preserve"> with Server-Sent Events (SSE) streaming, real-time filter sync via Zustand, and integration with NestJS backend using OpenAI/Perplexity and Typesense full-text search.</w:t>
-      </w:r>
-    </w:p>
-    <w:p>
-      <w:pPr>
-        <w:pStyle w:val="ListBullet"/>
-      </w:pPr>
-      <w:r>
-        <w:t>Delivered SEO-first programmatic listing pages (city/state/zip catch-all routes), property detail SSR, investment calculators (DSCR, cash flow), and mortgage pre-approval portal with document upload workflows.</w:t>
-      </w:r>
-    </w:p>
-    <w:p>
-      <w:pPr>
-        <w:pStyle w:val="ListBullet"/>
-      </w:pPr>
-      <w:r>
-        <w:t>Integrated multi-channel analytics (GA4, Google Ads, Facebook Pixel, LogRocket, Vercel Analytics) and Fingerprint.js fraud detection on lead capture forms.</w:t>
-      </w:r>
-    </w:p>
-    <w:p>
-      <w:pPr>
-        <w:pStyle w:val="ListBullet"/>
-      </w:pPr>
-      <w:r>
-        <w:t>Established dev tooling with Husky, lint-staged, Prettier, and TanStack Query; migrated legacy webpack multi-app frontend to modern App Router architecture.</w:t>
-      </w:r>
-    </w:p>
-    <w:p>
-      <w:r>
-        <w:t>Full Stack Developer HomeAbroad Inc. · Full-time Apr 2022 – Present 4 yrs 3 mos · Remote Fintech/real-estate platform — software design and full-stack application development</w:t>
-      </w:r>
-    </w:p>
-    <w:p>
-      <w:pPr>
-        <w:pStyle w:val="ListBullet"/>
-      </w:pPr>
-      <w:r>
-        <w:t xml:space="preserve">Built and maintained the core </w:t>
-      </w:r>
-      <w:r>
-        <w:rPr>
-          <w:b/>
-        </w:rPr>
-        <w:t>NestJS REST API</w:t>
-      </w:r>
-      <w:r>
-        <w:t xml:space="preserve"> (appi) — auth (JWT, OAuth, magic links), property search, loan estimates, pre-approval, CRM sync, document management, and AI features via LangChain/LangGraph with TypeORM/MySQL, Redis throttling, and BullMQ email queues.</w:t>
-      </w:r>
-    </w:p>
-    <w:p>
-      <w:pPr>
-        <w:pStyle w:val="ListBullet"/>
-      </w:pPr>
-      <w:r>
-        <w:t xml:space="preserve">Developed the </w:t>
-      </w:r>
-      <w:r>
-        <w:rPr>
-          <w:b/>
-        </w:rPr>
-        <w:t>React multi-app frontend</w:t>
-      </w:r>
-      <w:r>
-        <w:t xml:space="preserve"> (ha-realtor-plat) with Webpack/Tailwind — agent dashboard, investor portal, property maps (Leaflet), loan calculators, term sheets, and document portal with role-based routing for RE agents, MLOs, and clients.</w:t>
-      </w:r>
-    </w:p>
-    <w:p>
-      <w:pPr>
-        <w:pStyle w:val="ListBullet"/>
-      </w:pPr>
-      <w:r>
-        <w:t xml:space="preserve">Owned the </w:t>
-      </w:r>
-      <w:r>
-        <w:rPr>
-          <w:b/>
-        </w:rPr>
-        <w:t>PHP integration backend</w:t>
-      </w:r>
-      <w:r>
-        <w:t xml:space="preserve"> (3rdpartycomms) — 60+ webhook receivers, 40+ cron jobs, and 12+ internal agent tools (ClearPath AI, Match AI, Power Dialer, comms centers) integrating Twilio, Zoho CRM, SendGrid, Retell AI, Floify, and Google Gemini.</w:t>
-      </w:r>
-    </w:p>
-    <w:p>
-      <w:pPr>
-        <w:pStyle w:val="ListBullet"/>
-      </w:pPr>
-      <w:r>
-        <w:t xml:space="preserve">Authored reusable </w:t>
-      </w:r>
-      <w:r>
-        <w:rPr>
-          <w:b/>
-        </w:rPr>
-        <w:t>TypeScript loan estimate library</w:t>
-      </w:r>
-      <w:r>
-        <w:t xml:space="preserve"> (estimate-calculator) — fees, DSCR, liquidity, Excel rate-sheet parsing; consumed across API and frontend.</w:t>
-      </w:r>
-    </w:p>
-    <w:p>
-      <w:pPr>
-        <w:pStyle w:val="ListBullet"/>
-      </w:pPr>
-      <w:r>
-        <w:t xml:space="preserve">Shipped </w:t>
-      </w:r>
-      <w:r>
-        <w:rPr>
-          <w:b/>
-        </w:rPr>
-        <w:t>AWS Lambda headless browser service</w:t>
-      </w:r>
-      <w:r>
-        <w:t xml:space="preserve"> (mortgage-pricer) — Puppeteer scrapers for 11 Non-QM/DSCR lender pricing portals with S3 audit screenshots and API Gateway deployment.</w:t>
-      </w:r>
-    </w:p>
-    <w:p>
-      <w:pPr>
-        <w:pStyle w:val="ListBullet"/>
-      </w:pPr>
-      <w:r>
-        <w:t xml:space="preserve">Built </w:t>
-      </w:r>
-      <w:r>
-        <w:rPr>
-          <w:b/>
-        </w:rPr>
-        <w:t>property data pipelines</w:t>
-      </w:r>
-      <w:r>
-        <w:t xml:space="preserve"> — Python scrapers (Zillow, Roofstock, Homes.com, HouseCanary) + Node.js ingestion to MySQL/Typesense with SSH tunnel staging workflows.</w:t>
-      </w:r>
-    </w:p>
-    <w:p>
-      <w:pPr>
-        <w:pStyle w:val="ListBullet"/>
-      </w:pPr>
-      <w:r>
-        <w:t xml:space="preserve">Led </w:t>
-      </w:r>
-      <w:r>
-        <w:rPr>
-          <w:b/>
-        </w:rPr>
-        <w:t>AWS Lightsail → Hetzner infrastructure migration</w:t>
-      </w:r>
-      <w:r>
-        <w:t xml:space="preserve"> with xtrabackup streaming, automated bash tooling, and zero-downtime DNS cutover procedures.</w:t>
-      </w:r>
-    </w:p>
-    <w:p>
-      <w:pPr>
-        <w:pStyle w:val="ListBullet"/>
-      </w:pPr>
-      <w:r>
-        <w:t xml:space="preserve">Implemented </w:t>
-      </w:r>
-      <w:r>
-        <w:rPr>
-          <w:b/>
-        </w:rPr>
-        <w:t>GitHub Actions CI/CD</w:t>
-      </w:r>
-      <w:r>
-        <w:t xml:space="preserve"> pipelines — build, SFTP upload, SSH deploy to production with staging/main workflows and rollback support.</w:t>
-      </w:r>
-    </w:p>
-    <w:p>
-      <w:pPr>
-        <w:pStyle w:val="ListBullet"/>
-      </w:pPr>
-      <w:r>
-        <w:t>Maintained WordPress marketing site with custom Tailwind theme, Gutenberg blocks, SEO/lead capture integrated with Zoho CRM and webhook backend.</w:t>
-      </w:r>
-    </w:p>
-    <w:p>
-      <w:pPr>
-        <w:pStyle w:val="Heading2"/>
-      </w:pPr>
-      <w:r>
-        <w:t>Key Projects</w:t>
-      </w:r>
-    </w:p>
-    <w:p>
-      <w:pPr>
-        <w:pStyle w:val="Heading3"/>
-      </w:pPr>
-      <w:r>
-        <w:t>Ziffy.ai Platform</w:t>
-      </w:r>
-    </w:p>
-    <w:p>
-      <w:r>
-        <w:t>Next.js 15 · React 19 · Zustand · SSE · Vercel AI-native investor platform with streaming NLP search, SEO listings, DSCR calculators, and dual-brand deployment.</w:t>
-      </w:r>
-    </w:p>
-    <w:p>
-      <w:pPr>
-        <w:pStyle w:val="Heading3"/>
-      </w:pPr>
-      <w:r>
-        <w:t>appi — Core API</w:t>
-      </w:r>
-    </w:p>
-    <w:p>
-      <w:r>
-        <w:t>NestJS · TypeORM · Redis · Typesense · LangChain Modular REST API powering property search, loan estimates, auth, CRM sync, and AI-assisted SEO content.</w:t>
-      </w:r>
-    </w:p>
-    <w:p>
-      <w:pPr>
-        <w:pStyle w:val="Heading3"/>
-      </w:pPr>
-      <w:r>
-        <w:t>3rdpartycomms</w:t>
-      </w:r>
-    </w:p>
-    <w:p>
-      <w:r>
-        <w:t>PHP 8 · MySQL · Redis · Cloudflare Zero Trust Webhook-driven integration hub with agent AI tools, nurture campaigns, and multi-channel comms orchestration.</w:t>
-      </w:r>
-    </w:p>
-    <w:p>
-      <w:pPr>
-        <w:pStyle w:val="Heading3"/>
-      </w:pPr>
-      <w:r>
-        <w:t>mortgage-pricer</w:t>
-      </w:r>
-    </w:p>
-    <w:p>
-      <w:r>
-        <w:t>TypeScript · Puppeteer · AWS Lambda · Serverless Headless browser microservice scraping live rates from 11 lender portals with pluggable scraper registry.</w:t>
-      </w:r>
-    </w:p>
-    <w:p>
-      <w:pPr>
-        <w:pStyle w:val="Heading3"/>
-      </w:pPr>
-      <w:r>
-        <w:t>estimate-calculator</w:t>
-      </w:r>
-    </w:p>
-    <w:p>
-      <w:r>
-        <w:t>TypeScript · Jest · Zero-dep library Reusable mortgage calculation engine — fees, liquidity, DSCR, points/pricing scenarios, Excel rate sheets.</w:t>
-      </w:r>
-    </w:p>
-    <w:p>
-      <w:pPr>
-        <w:pStyle w:val="Heading3"/>
-      </w:pPr>
-      <w:r>
-        <w:t>data-pipelines</w:t>
-      </w:r>
-    </w:p>
-    <w:p>
-      <w:r>
-        <w:t>Python · Node.js · Typesense · AWS S3 End-to-end property data acquisition — multi-source scrapers with chunked/resumable ingestion to MySQL.</w:t>
-      </w:r>
-    </w:p>
-    <w:p>
-      <w:pPr>
-        <w:pStyle w:val="Heading2"/>
-      </w:pPr>
-      <w:r>
-        <w:t>Education</w:t>
-      </w:r>
-    </w:p>
-    <w:p>
-      <w:r>
-        <w:t>Post Graduate Diploma in Computer Application (PGDCA) Utkal University HDVSc Degree College, Panaspada, Puri Honors / Regents High School Diploma HDVSc Degree College, Panaspada, Puri 2016 – 2019 Certifications</w:t>
-      </w:r>
-    </w:p>
-    <w:p>
-      <w:pPr>
-        <w:pStyle w:val="Heading2"/>
-      </w:pPr>
-    </w:p>
-    <w:p>
-      <w:r>
-        <w:t>Web Development Masterclass — Udemy</w:t>
-        <w:t xml:space="preserve"> </w:t>
-        <w:t>Python 3 Ultimate Guide — Udemy</w:t>
-        <w:t xml:space="preserve"> </w:t>
-        <w:t>React Complete Guide (Hooks &amp; Redux) — Udemy</w:t>
-        <w:t xml:space="preserve"> </w:t>
-        <w:t>Practical Database Course (6 in 1) — Udemy</w:t>
-        <w:t xml:space="preserve"> </w:t>
-        <w:t>Amazon Affiliate E-Commerce Store — Udemy</w:t>
-        <w:t xml:space="preserve"> </w:t>
-        <w:t>Practical MongoDB + PHP — Udemy</w:t>
-        <w:t xml:space="preserve"> </w:t>
-        <w:t>Complete NodeJS (Express, Socket.io, MongoDB) — Udemy</w:t>
-        <w:t xml:space="preserve"> </w:t>
-        <w:t>PGDCA — Survey Institute Gulf Training</w:t>
-        <w:t xml:space="preserve"> </w:t>
-        <w:t>JavaScript, Bootstrap &amp; PHP — Udemy</w:t>
-        <w:t xml:space="preserve"> </w:t>
-        <w:t>Javascript &amp; JQuery — Udemy</w:t>
-        <w:t xml:space="preserve"> </w:t>
-        <w:t>Adobe Photoshop CC 2015 — Udemy</w:t>
-        <w:t xml:space="preserve"> </w:t>
-        <w:t>HTML &amp; CSS Programming — Udemy</w:t>
-        <w:t xml:space="preserve"> </w:t>
-        <w:t>JS Algorithms &amp; Data Structures — freeCodeCamp</w:t>
-        <w:t xml:space="preserve"> </w:t>
-        <w:t>Responsive Web Design — freeCodeCamp</w:t>
-        <w:t xml:space="preserve"> </w:t>
+        <w:drawing>
+          <wp:inline xmlns:a="http://schemas.openxmlformats.org/drawingml/2006/main" xmlns:pic="http://schemas.openxmlformats.org/drawingml/2006/picture">
+            <wp:extent cx="7560000" cy="10692000"/>
+            <wp:docPr id="1" name="Picture 1"/>
+            <wp:cNvGraphicFramePr>
+              <a:graphicFrameLocks noChangeAspect="1"/>
+            </wp:cNvGraphicFramePr>
+            <a:graphic>
+              <a:graphicData uri="http://schemas.openxmlformats.org/drawingml/2006/picture">
+                <pic:pic>
+                  <pic:nvPicPr>
+                    <pic:cNvPr id="0" name="resume-page.png"/>
+                    <pic:cNvPicPr/>
+                  </pic:nvPicPr>
+                  <pic:blipFill>
+                    <a:blip r:embed="rId9"/>
+                    <a:stretch>
+                      <a:fillRect/>
+                    </a:stretch>
+                  </pic:blipFill>
+                  <pic:spPr>
+                    <a:xfrm>
+                      <a:off x="0" y="0"/>
+                      <a:ext cx="7560000" cy="10692000"/>
+                    </a:xfrm>
+                    <a:prstGeom prst="rect"/>
+                  </pic:spPr>
+                </pic:pic>
+              </a:graphicData>
+            </a:graphic>
+          </wp:inline>
+        </w:drawing>
       </w:r>
     </w:p>
     <w:sectPr>
-      <w:pgSz w:w="12240" w:h="15840"/>
-      <w:pgMar w:top="1440" w:right="1800" w:bottom="1440" w:left="1800" w:header="720" w:footer="720" w:gutter="0"/>
+      <w:pgSz w:w="11906" w:h="16838"/>
+      <w:pgMar w:top="0" w:right="0" w:bottom="0" w:left="0" w:header="720" w:footer="720" w:gutter="0"/>
       <w:cols w:space="720"/>
       <w:docGrid w:linePitch="360"/>
     </w:sectPr>

</xml_diff>